<commit_message>
3John: full meaning audit 2026-09-23 — 1 title fix + builder root fix (positional pairing for duplicate MSG ranges), gates 1-8 PASS
</commit_message>
<xml_diff>
--- a/gdocs_build/3John.docx
+++ b/gdocs_build/3John.docx
@@ -20,7 +20,7 @@
         <w:pStyle w:val="Heading1"/>
       </w:pPr>
       <w:r>
-        <w:t>Chapter 1 — A Shout-Out to My honored</w:t>
+        <w:t>Chapter 1 — A Shout-Out to My Honored</w:t>
       </w:r>
     </w:p>
     <w:tbl>
@@ -448,7 +448,7 @@
               <w:rPr>
                 <w:sz w:val="18"/>
               </w:rPr>
-              <w:t>↑ 위 MSG(9-10) 계속</w:t>
+              <w:t>As if that weren't bad enough, he not only refuses hospitality to traveling Christians but tries to stop others from welcoming them. Worse yet, instead of inviting them in he throws them out.</w:t>
             </w:r>
           </w:p>
         </w:tc>
@@ -732,7 +732,7 @@
               <w:rPr>
                 <w:sz w:val="18"/>
               </w:rPr>
-              <w:t>↑ 위 MSG(13-14) 계속</w:t>
+              <w:t>Peace to you. The friends here say hello. Greet our friends there by name.</w:t>
             </w:r>
           </w:p>
         </w:tc>
@@ -779,116 +779,6 @@
                 <w:sz w:val="18"/>
               </w:rPr>
               <w:t>평안이 있기를! 여기 있는 친구들이 안부를 전해. 저기 있는 친구들에게도 이름을 하나하나 불러가며 안부를 전해줘.</w:t>
-            </w:r>
-          </w:p>
-        </w:tc>
-      </w:tr>
-      <w:tr>
-        <w:tc>
-          <w:tcPr>
-            <w:tcW w:type="dxa" w:w="2880"/>
-          </w:tcPr>
-          <w:p>
-            <w:r/>
-            <w:r>
-              <w:rPr>
-                <w:b/>
-                <w:sz w:val="16"/>
-              </w:rPr>
-              <w:t>9-10</w:t>
-            </w:r>
-          </w:p>
-          <w:p>
-            <w:r>
-              <w:rPr>
-                <w:sz w:val="18"/>
-              </w:rPr>
-              <w:t>As if that weren't bad enough, he not only refuses hospitality to traveling Christians but tries to stop others from welcoming them. Worse yet, instead of inviting them in he throws them out.</w:t>
-            </w:r>
-          </w:p>
-        </w:tc>
-        <w:tc>
-          <w:tcPr>
-            <w:tcW w:type="dxa" w:w="2880"/>
-          </w:tcPr>
-          <w:p>
-            <w:r/>
-            <w:r>
-              <w:rPr>
-                <w:b/>
-                <w:sz w:val="18"/>
-              </w:rPr>
-              <w:t>(확인 필요: 대응 틴즈 문단 없음)</w:t>
-            </w:r>
-          </w:p>
-        </w:tc>
-        <w:tc>
-          <w:tcPr>
-            <w:tcW w:type="dxa" w:w="2880"/>
-          </w:tcPr>
-          <w:p>
-            <w:r/>
-            <w:r>
-              <w:rPr>
-                <w:b/>
-                <w:sz w:val="18"/>
-              </w:rPr>
-              <w:t>(확인 필요: 대응 틴즈 문단 없음)</w:t>
-            </w:r>
-          </w:p>
-        </w:tc>
-      </w:tr>
-      <w:tr>
-        <w:tc>
-          <w:tcPr>
-            <w:tcW w:type="dxa" w:w="2880"/>
-          </w:tcPr>
-          <w:p>
-            <w:r/>
-            <w:r>
-              <w:rPr>
-                <w:b/>
-                <w:sz w:val="16"/>
-              </w:rPr>
-              <w:t>13-14</w:t>
-            </w:r>
-          </w:p>
-          <w:p>
-            <w:r>
-              <w:rPr>
-                <w:sz w:val="18"/>
-              </w:rPr>
-              <w:t>Peace to you. The friends here say hello. Greet our friends there by name.</w:t>
-            </w:r>
-          </w:p>
-        </w:tc>
-        <w:tc>
-          <w:tcPr>
-            <w:tcW w:type="dxa" w:w="2880"/>
-          </w:tcPr>
-          <w:p>
-            <w:r/>
-            <w:r>
-              <w:rPr>
-                <w:b/>
-                <w:sz w:val="18"/>
-              </w:rPr>
-              <w:t>(확인 필요: 대응 틴즈 문단 없음)</w:t>
-            </w:r>
-          </w:p>
-        </w:tc>
-        <w:tc>
-          <w:tcPr>
-            <w:tcW w:type="dxa" w:w="2880"/>
-          </w:tcPr>
-          <w:p>
-            <w:r/>
-            <w:r>
-              <w:rPr>
-                <w:b/>
-                <w:sz w:val="18"/>
-              </w:rPr>
-              <w:t>(확인 필요: 대응 틴즈 문단 없음)</w:t>
             </w:r>
           </w:p>
         </w:tc>

</xml_diff>